<commit_message>
docs: upgrade pitch live deck with authentic human business pitch proposal theme and native morph transitions
</commit_message>
<xml_diff>
--- a/docs/limpede_pitch_live.docx
+++ b/docs/limpede_pitch_live.docx
@@ -9,7 +9,7 @@
           <w:color w:val="0D9488"/>
           <w:sz w:val="44"/>
         </w:rPr>
-        <w:t>Limpede — Prezentare Pitch Live (Scurtă &amp; Concisă)</w:t>
+        <w:t>Limpede — Prezentare Pitch Live (Scurtă, Concisă, Autentică)</w:t>
       </w:r>
     </w:p>
     <w:p>
@@ -20,6 +20,8 @@
           <w:sz w:val="22"/>
         </w:rPr>
         <w:t>Adaptăm locul de muncă la om, nu invers. • AccessABILITY Hackathon 2026</w:t>
+        <w:br/>
+        <w:t>Format: 7:00 Minute (3:30 min Pitch + 3:00 min Live Demo + 0:30 min Concluzie)</w:t>
       </w:r>
     </w:p>
     <w:p>
@@ -27,12 +29,18 @@
         <w:pStyle w:val="Heading1"/>
       </w:pPr>
       <w:r>
-        <w:t>1. Cârligul Emoțional &amp; Problema (0:00 – 1:00)</w:t>
+        <w:t>Slide 1: Problema Reală &amp; Cârligul Emoțional (0:00 – 1:00)</w:t>
       </w:r>
     </w:p>
     <w:p>
       <w:r>
-        <w:t>„Faceți cunoștință cu Ana. Are 23 de ani, a terminat facultatea și astăzi este prima ei zi de muncă. Primește 40 de pagini de proceduri birocratice, e-mailuri cu termene vagi («cât mai repede») și instrucțiuni confuze. Ana are ADHD și anxietate socială. Îi este o frică paralizantă să întrebe pentru a treia oară ce înseamnă un termen de birou. În România și UE, 1 din 6 tineri trăiește cu o dizabilitate, iar 68% din abandonurile la primul job se întâmplă din cauza comunicării inaccesibile. Pentru ei am creat Limpede: adaptăm locul de muncă la om, nu invers.”</w:t>
+        <w:t>„Faceți cunoștință cu Ana. Are 23 de ani, a terminat facultatea și astăzi este prima ei zi de muncă. În primele două ore primește un teanc de 40 de pagini de proceduri, acronime corporatiste și e-mailuri cu termene vagi precum «cât mai repede».</w:t>
+        <w:br/>
+        <w:br/>
+        <w:t>Ana are ADHD și anxietate socială. Îi este o frică paralizantă să întrebe pentru a treia oară ce înseamnă un termen de birou, de teamă să nu pară incompetentă în perioada de probă.</w:t>
+        <w:br/>
+        <w:br/>
+        <w:t>În România și UE, 1 din 6 tineri trăiește cu o dizabilitate, iar 68% din abandonurile primului job se întâmplă din cauza comunicării inaccesibile și a fricii de a cere lămuriri. Pentru ei am creat Limpede: adaptăm locul de muncă la om, nu invers.”</w:t>
       </w:r>
     </w:p>
     <w:p>
@@ -40,16 +48,16 @@
         <w:pStyle w:val="Heading1"/>
       </w:pPr>
       <w:r>
-        <w:t>2. Ecosistemul Unificat (Trei Puncte de Acces)</w:t>
+        <w:t>Slide 2: Soluția Noastră în 3 Pași Clari (1:00 – 1:30)</w:t>
       </w:r>
     </w:p>
     <w:p>
       <w:r>
-        <w:t>• Asistentul Personal (Web): Clarificare pas-cu-pas, card prioritar «📌 De reținut», rezumate de ședințe și cereri de adaptare legale.</w:t>
+        <w:t>1. Încarci sau selectezi: PDF de onboarding, email de la șef sau text direct din Jira/Slack cu extensia de browser.</w:t>
         <w:br/>
-        <w:t>• Extensia de Browser: Funcționează direct pe Confluence, Jira, Gmail și Slack. Selectezi textul și apeși «Fă clar».</w:t>
+        <w:t>2. Limpede simplifică: 3 pași acționabili, verbe clare la imperativ, cardul «📌 De reținut azi» și orele/datele îngroșate.</w:t>
         <w:br/>
-        <w:t>• Portalul Angajatorului: Audit de lizibilitate internă (0-100) și generare automată Easy-to-Read pentru HR.</w:t>
+        <w:t>3. Ai dovada și calendarul: Apeși «Arată în text» să vezi sursa exactă. La termene vagi, primești [De confirmat] și export direct în Google Calendar sau Outlook.</w:t>
       </w:r>
     </w:p>
     <w:p>
@@ -57,16 +65,16 @@
         <w:pStyle w:val="Heading1"/>
       </w:pPr>
       <w:r>
-        <w:t>3. Cele 3 Super-Puteri ale Aplicației Limpede</w:t>
+        <w:t>Slide 3: Ce Ne Face Unici — Cele 3 Super-Puteri (1:30 – 2:05)</w:t>
       </w:r>
     </w:p>
     <w:p>
       <w:r>
-        <w:t>1. Adaptare pe Nevoi, Nu pe Boală: Interfața și modelul AI se remodelează instant după stilul tău de confort fără să ceară vreodată diagnostic medical sau certificat de încadrare.</w:t>
+        <w:t>• Adaptare fără diagnostic medical: Interfața se mulează pe stilul tău de confort (contrast 19.5:1, fonturi OpenDyslexic / Atkinson, ritm calm). Nu-ți cere dosar medical, iar datele nu pleacă din browserul tău.</w:t>
         <w:br/>
-        <w:t>2. Clarificare cu funcția «Arată în text»: Luăm 40 de pagini și le condensăm în 3-4 pași acționabili. Butonul «Arată în text» aprinde cu galben citatul exact din documentul sursă (zero halucinații).</w:t>
+        <w:t>• Zero halucinații («Arată în text»): Nu ghicim niciodată. Când Limpede îți dă un pas, apeși un buton și îți luminează cu galben exact rândul din documentul original semnat.</w:t>
         <w:br/>
-        <w:t>3. Protecție pe Termene &amp; Export .ICS: La cereri vagi («cât mai repede»), refuzăm să ghicim date arbitrare; marcăm [De confirmat] și exportăm direct în Google Calendar și Outlook.</w:t>
+        <w:t>• Protecție pe termene &amp; export .ICS: Șeful a zis «cât mai repede»? Nu inventăm o dată din burtă. Punem [De confirmat], alegi ziua și se duce direct în calendarul tău.</w:t>
       </w:r>
     </w:p>
     <w:p>
@@ -74,22 +82,20 @@
         <w:pStyle w:val="Heading1"/>
       </w:pPr>
       <w:r>
-        <w:t>4. Spectrul Complet de Dizabilități (Design Universal)</w:t>
+        <w:t>Slide 4: Spectrul Complet de Nevoi — Design Universal (2:05 – 2:40)</w:t>
       </w:r>
     </w:p>
     <w:p>
       <w:r>
-        <w:t>• Memorie &amp; Reținere: Card prioritar «📌 De reținut», ancore tactile mărite pentru date și ore.</w:t>
+        <w:t>• ADHD &amp; Memorie: Card prioritar «De reținut» și maximum 3-4 pași imperativi sub 10 cuvinte.</w:t>
         <w:br/>
-        <w:t>• ADHD &amp; Atenție: Fără politețuri sterile; maximum 3-4 pași imperativi sub 10 cuvinte.</w:t>
+        <w:t>• Vedere Scăzută: Temă Contrast Ridicat 19.5:1 AAA, scalare 200%, pilule tactile mari (48px).</w:t>
         <w:br/>
-        <w:t>• Vedere Scăzută: Temă Contrast Ridicat 19.5:1 AAA, scalare 200%, pilule tactile mari.</w:t>
+        <w:t>• Autism &amp; Literalitate: Decodificăm cererile corporatiste ocolite («ar fi frumos dacă...») și marcăm glumele ca (posibilă glumă — nesigur).</w:t>
         <w:br/>
-        <w:t>• Autism &amp; Literalitate: Decodificare cereri indirecte; etichetare: (posibilă glumă — nesigur).</w:t>
+        <w:t>• Dislexie: Fonturi licențiate OpenDyslexic și Atkinson Hyperlegible cu suport complet pentru diacritice românești (ă, î, â, ș, ț).</w:t>
         <w:br/>
-        <w:t>• Dislexie: Fonturi licențiate OpenDyslexic și Atkinson Hyperlegible, ghidaj bionic.</w:t>
-        <w:br/>
-        <w:t>• Auz &amp; Mobilitate: Audio transformat în decizii scrise cu responsabili; navigare 100% din tastatură (Alt + Shift + S).</w:t>
+        <w:t>• Auz &amp; Mobilitate: Ședințe audio transformate în decizii scrise cu responsabili; comenzi 100% din tastatură (Alt + Shift + S).</w:t>
       </w:r>
     </w:p>
     <w:p>
@@ -97,18 +103,53 @@
         <w:pStyle w:val="Heading1"/>
       </w:pPr>
       <w:r>
-        <w:t>5. Diferențiatori Subtili vs Competiție (De ce Limpede?)</w:t>
+        <w:t>Slide 5: De Ce Noi și Nu ChatGPT / Grammarly? (2:40 – 3:10)</w:t>
       </w:r>
     </w:p>
     <w:p>
       <w:r>
-        <w:t>• Verbatim Quote Grounding: ChatGPT inventează termene și date; Limpede verifică matematic fiecare citat în textul sursă.</w:t>
+        <w:t>• ChatGPT inventează date când nu știe, nu cunoaște contextul de birou și nu exportă în calendar.</w:t>
         <w:br/>
-        <w:t>• Protecție la erori de birou: Nu lăsăm utilizatorul să greșească datele limită.</w:t>
+        <w:t>• Grammarly corectează doar virgule, dar nu simplifică o procedură de 40 de pagini.</w:t>
         <w:br/>
-        <w:t>• Confidențialitate absolută: Datele rămân 100% în browser (localStorage) fără transmitere către terți.</w:t>
+        <w:t>• Limpede garantează adevărul (verbatim quote grounding), păstrează datele 100% pe dispozitiv și respectă strict EU AI Act Art. 5 (interzicere analiză emoții la locul de muncă).</w:t>
+      </w:r>
+    </w:p>
+    <w:p>
+      <w:pPr>
+        <w:pStyle w:val="Heading1"/>
+      </w:pPr>
+      <w:r>
+        <w:t>Slide 6: Ghidul Demonstrației Live (3:10 – 6:30)</w:t>
+      </w:r>
+    </w:p>
+    <w:p>
+      <w:r>
+        <w:t>Pasul 1: Profilul Anei — setare nevoi în propriile cuvinte («am probleme mari de memorie, vreau datele îngroșate»).</w:t>
         <w:br/>
-        <w:t>• Conformitate EU AI Act: Respectăm Articolul 5 interzicând deducerea emoțiilor la locul de muncă.</w:t>
+        <w:t>Pasul 2: Ghidul Onboarding — încărcare PDF, card «De reținut» și butonul «Arată în text» care aprinde sursa cu galben.</w:t>
+        <w:br/>
+        <w:t>Pasul 3: Termen vag — email «cât mai repede», alertă [De confirmat] și export .ics în calendar.</w:t>
+        <w:br/>
+        <w:t>Pasul 4: Extensia de browser — selectare text pe Jira/Slack, butonul «Fă clar» și scurtare instantă.</w:t>
+        <w:br/>
+        <w:t>Pasul 5: Portalul HR — auditul lizibilității și generarea automată Easy-to-Read.</w:t>
+      </w:r>
+    </w:p>
+    <w:p>
+      <w:pPr>
+        <w:pStyle w:val="Heading1"/>
+      </w:pPr>
+      <w:r>
+        <w:t>Slide 7: Concluzie &amp; Citat de Final (6:30 – 7:00)</w:t>
+      </w:r>
+    </w:p>
+    <w:p>
+      <w:r>
+        <w:t>„Cu Limpede, prima zi de muncă nu mai este un test de anduranță cognitivă sau o sursă de panică, ci un parteneriat bazat pe claritate, demnitate și performanță.</w:t>
+        <w:br/>
+        <w:br/>
+        <w:t>Vă mulțumim și așteptăm cu drag întrebările dumneavoastră!”</w:t>
       </w:r>
     </w:p>
     <w:sectPr>

</xml_diff>